<commit_message>
v11.11: hotkey-only shipping build + updated v1.0 release docs
- Panel is summoned only by Ctrl+Shift+H, gated to the Hair/Head picker via one on-demand walk; no Tick heartbeat / no auto-open / no per-tick logging (removed the 2s heartbeat that tripped SE's per-tick profiler).
- Docs: hotkey-only usage + tab-round-trip numbering; ImpUI recommended-not-required; controller notes (labels+numbers render; panel is KBM; selection ring KBM-only); removed unverified console fallback.
- Adds src_v11_11/ and scripts/build_and_install_v11_11.ps1.
</commit_message>
<xml_diff>
--- a/docs/INSTALL.docx
+++ b/docs/INSTALL.docx
@@ -2,6 +2,14 @@
 <file path=word/document.xml><?xml version="1.0" encoding="utf-8"?>
 <w:document xmlns:w="http://schemas.openxmlformats.org/wordprocessingml/2006/main" xmlns:m="http://schemas.openxmlformats.org/officeDocument/2006/math" xmlns:r="http://schemas.openxmlformats.org/officeDocument/2006/relationships" xmlns:o="urn:schemas-microsoft-com:office:office" xmlns:v="urn:schemas-microsoft-com:vml" xmlns:w10="urn:schemas-microsoft-com:office:word" xmlns:a="http://schemas.openxmlformats.org/drawingml/2006/main" xmlns:pic="http://schemas.openxmlformats.org/drawingml/2006/picture" xmlns:wp="http://schemas.openxmlformats.org/drawingml/2006/wordprocessingDrawing">
   <w:body>
+    <w:p>
+      <w:pPr>
+        <w:pStyle w:val="Title"/>
+      </w:pPr>
+      <w:r>
+        <w:t xml:space="preserve">CCNS — Install Guide</w:t>
+      </w:r>
+    </w:p>
     <w:p>
       <w:pPr>
         <w:pStyle w:val="Heading1"/>
@@ -125,52 +133,13 @@
         <w:rPr>
           <w:b/>
         </w:rPr>
-        <w:t xml:space="preserve">BG3 ImprovedUI (ImpUI)</w:t>
-      </w:r>
-      <w:r>
-        <w:t xml:space="preserve"> </w:t>
-      </w:r>
-      <w:r>
-        <w:t xml:space="preserve">— the Patch 8 fork, NexusMods mod</w:t>
-      </w:r>
-      <w:r>
-        <w:t xml:space="preserve"> </w:t>
-      </w:r>
-      <w:r>
-        <w:rPr>
-          <w:b/>
-        </w:rPr>
-        <w:t xml:space="preserve">16649</w:t>
-      </w:r>
-      <w:r>
-        <w:t xml:space="preserve"> </w:t>
-      </w:r>
-      <w:r>
-        <w:t xml:space="preserve">(</w:t>
-      </w:r>
-      <w:r>
-        <w:rPr>
-          <w:i/>
-        </w:rPr>
-        <w:t xml:space="preserve">ImpUI_P8_Fork</w:t>
-      </w:r>
-      <w:r>
-        <w:t xml:space="preserve">). Install and enable it</w:t>
-      </w:r>
-      <w:r>
-        <w:t xml:space="preserve"> </w:t>
-      </w:r>
-      <w:r>
-        <w:rPr>
-          <w:b/>
-        </w:rPr>
-        <w:t xml:space="preserve">before</w:t>
-      </w:r>
-      <w:r>
-        <w:t xml:space="preserve"> </w:t>
-      </w:r>
-      <w:r>
-        <w:t xml:space="preserve">CCNS.</w:t>
+        <w:t xml:space="preserve">BG3 Mod Manager (BG3MM)</w:t>
+      </w:r>
+      <w:r>
+        <w:t xml:space="preserve"> </w:t>
+      </w:r>
+      <w:r>
+        <w:t xml:space="preserve">— strongly recommended. You can get it from its NexusMods page. CCNS needs to be in your active load order, and a mod manager makes that one click.</w:t>
       </w:r>
     </w:p>
     <w:p>
@@ -183,15 +152,48 @@
       </w:pPr>
       <w:r>
         <w:rPr>
-          <w:b/>
-        </w:rPr>
-        <w:t xml:space="preserve">BG3 Mod Manager (BG3MM)</w:t>
-      </w:r>
-      <w:r>
-        <w:t xml:space="preserve"> </w:t>
-      </w:r>
-      <w:r>
-        <w:t xml:space="preserve">— strongly recommended. You can get it from its NexusMods page. CCNS needs to be in your active load order, and a mod manager makes that one click.</w:t>
+          <w:i/>
+        </w:rPr>
+        <w:t xml:space="preserve">(Optional / recommended)</w:t>
+      </w:r>
+      <w:r>
+        <w:t xml:space="preserve"> </w:t>
+      </w:r>
+      <w:r>
+        <w:rPr>
+          <w:b/>
+        </w:rPr>
+        <w:t xml:space="preserve">BG3 ImprovedUI</w:t>
+      </w:r>
+      <w:r>
+        <w:t xml:space="preserve"> </w:t>
+      </w:r>
+      <w:r>
+        <w:t xml:space="preserve">— the Patch 8 fork, NexusMods mod</w:t>
+      </w:r>
+      <w:r>
+        <w:t xml:space="preserve"> </w:t>
+      </w:r>
+      <w:r>
+        <w:rPr>
+          <w:b/>
+        </w:rPr>
+        <w:t xml:space="preserve">16649</w:t>
+      </w:r>
+      <w:r>
+        <w:t xml:space="preserve"> </w:t>
+      </w:r>
+      <w:r>
+        <w:t xml:space="preserve">(</w:t>
+      </w:r>
+      <w:r>
+        <w:rPr>
+          <w:i/>
+        </w:rPr>
+        <w:t xml:space="preserve">ImpUI_P8_Fork</w:t>
+      </w:r>
+      <w:r>
+        <w:t xml:space="preserve">). Not required; CCNS runs without it, but the two are tested together.</w:t>
       </w:r>
     </w:p>
     <w:p>
@@ -542,7 +544,22 @@
         <w:t xml:space="preserve"> </w:t>
       </w:r>
       <w:r>
-        <w:t xml:space="preserve">Start a New Game and go to the appearance step (or open the Magic Mirror in-game). Open the hair or head grid — you should see a name and source-mod under each tile, numbers on modded tiles, and the search panel (it auto-opens in New Game character creation, or press</w:t>
+        <w:t xml:space="preserve">Start a New Game and go to the appearance step (or open the Magic Mirror / a mid-game appearance editor). Open the</w:t>
+      </w:r>
+      <w:r>
+        <w:t xml:space="preserve"> </w:t>
+      </w:r>
+      <w:r>
+        <w:rPr>
+          <w:b/>
+        </w:rPr>
+        <w:t xml:space="preserve">Head or Hair</w:t>
+      </w:r>
+      <w:r>
+        <w:t xml:space="preserve"> </w:t>
+      </w:r>
+      <w:r>
+        <w:t xml:space="preserve">grid — you should see a name and source-mod under each tile. Then press</w:t>
       </w:r>
       <w:r>
         <w:t xml:space="preserve"> </w:t>
@@ -554,7 +571,10 @@
         <w:t xml:space="preserve">Ctrl + Shift + H</w:t>
       </w:r>
       <w:r>
-        <w:t xml:space="preserve">).</w:t>
+        <w:t xml:space="preserve"> </w:t>
+      </w:r>
+      <w:r>
+        <w:t xml:space="preserve">to open the search panel.</w:t>
       </w:r>
     </w:p>
     <w:p>
@@ -566,6 +586,68 @@
         <w:t xml:space="preserve">Using it</w:t>
       </w:r>
       <w:bookmarkEnd w:id="24"/>
+    </w:p>
+    <w:p>
+      <w:pPr>
+        <w:pStyle w:val="FirstParagraph"/>
+      </w:pPr>
+      <w:r>
+        <w:rPr>
+          <w:b/>
+        </w:rPr>
+        <w:t xml:space="preserve">➤ IMPORTANT — HOW TO GET THE THUMBNAIL NUMBERS:</w:t>
+      </w:r>
+      <w:r>
+        <w:t xml:space="preserve"> </w:t>
+      </w:r>
+      <w:r>
+        <w:t xml:space="preserve">press</w:t>
+      </w:r>
+      <w:r>
+        <w:t xml:space="preserve"> </w:t>
+      </w:r>
+      <w:r>
+        <w:rPr>
+          <w:rStyle w:val="VerbatimChar"/>
+        </w:rPr>
+        <w:t xml:space="preserve">Ctrl + Shift + H</w:t>
+      </w:r>
+      <w:r>
+        <w:t xml:space="preserve"> </w:t>
+      </w:r>
+      <w:r>
+        <w:t xml:space="preserve">on the</w:t>
+      </w:r>
+      <w:r>
+        <w:t xml:space="preserve"> </w:t>
+      </w:r>
+      <w:r>
+        <w:rPr>
+          <w:b/>
+        </w:rPr>
+        <w:t xml:space="preserve">Head or Hair</w:t>
+      </w:r>
+      <w:r>
+        <w:t xml:space="preserve"> </w:t>
+      </w:r>
+      <w:r>
+        <w:t xml:space="preserve">screen to open the panel, then</w:t>
+      </w:r>
+      <w:r>
+        <w:t xml:space="preserve"> </w:t>
+      </w:r>
+      <w:r>
+        <w:rPr>
+          <w:b/>
+        </w:rPr>
+        <w:t xml:space="preserve">click back and forth between the Hair and Head tabs until the numbers appear on the thumbnails in both</w:t>
+      </w:r>
+      <w:r>
+        <w:t xml:space="preserve"> </w:t>
+      </w:r>
+      <w:r>
+        <w:t xml:space="preserve">— usually 1–2 round trips. The numbers should then be permanently assigned; if they’re ever removed during the game, repeat the round trip when you re-enter the CC panels.</w:t>
+      </w:r>
     </w:p>
     <w:p>
       <w:pPr>
@@ -573,6 +655,7 @@
           <w:ilvl w:val="0"/>
           <w:numId w:val="1004"/>
         </w:numPr>
+        <w:pStyle w:val="Compact"/>
       </w:pPr>
       <w:r>
         <w:rPr>
@@ -590,10 +673,7 @@
         <w:t xml:space="preserve">Ctrl + Shift + H</w:t>
       </w:r>
       <w:r>
-        <w:t xml:space="preserve"> </w:t>
-      </w:r>
-      <w:r>
-        <w:t xml:space="preserve">on any character-creation screen. It also opens automatically when you enter New Game character creation.</w:t>
+        <w:t xml:space="preserve">, while on the Head or Hair screen. The hotkey does nothing on other screens (by design); closing works anywhere.</w:t>
       </w:r>
     </w:p>
     <w:p>
@@ -602,6 +682,7 @@
           <w:ilvl w:val="0"/>
           <w:numId w:val="1004"/>
         </w:numPr>
+        <w:pStyle w:val="Compact"/>
       </w:pPr>
       <w:r>
         <w:rPr>
@@ -649,6 +730,7 @@
           <w:ilvl w:val="0"/>
           <w:numId w:val="1004"/>
         </w:numPr>
+        <w:pStyle w:val="Compact"/>
       </w:pPr>
       <w:r>
         <w:rPr>
@@ -669,6 +751,7 @@
           <w:ilvl w:val="0"/>
           <w:numId w:val="1004"/>
         </w:numPr>
+        <w:pStyle w:val="Compact"/>
       </w:pPr>
       <w:r>
         <w:rPr>
@@ -694,56 +777,6 @@
     </w:p>
     <w:p>
       <w:pPr>
-        <w:numPr>
-          <w:ilvl w:val="0"/>
-          <w:numId w:val="1004"/>
-        </w:numPr>
-      </w:pPr>
-      <w:r>
-        <w:rPr>
-          <w:b/>
-        </w:rPr>
-        <w:t xml:space="preserve">Console fallback:</w:t>
-      </w:r>
-      <w:r>
-        <w:t xml:space="preserve"> </w:t>
-      </w:r>
-      <w:r>
-        <w:t xml:space="preserve">if the hotkey is ever unavailable, open the Script Extender console, type</w:t>
-      </w:r>
-      <w:r>
-        <w:t xml:space="preserve"> </w:t>
-      </w:r>
-      <w:r>
-        <w:rPr>
-          <w:rStyle w:val="VerbatimChar"/>
-        </w:rPr>
-        <w:t xml:space="preserve">client</w:t>
-      </w:r>
-      <w:r>
-        <w:t xml:space="preserve"> </w:t>
-      </w:r>
-      <w:r>
-        <w:t xml:space="preserve">to switch to the client context, then run:</w:t>
-      </w:r>
-    </w:p>
-    <w:p>
-      <w:pPr>
-        <w:numPr>
-          <w:ilvl w:val="0"/>
-          <w:numId w:val="1000"/>
-        </w:numPr>
-        <w:pStyle w:val="SourceCode"/>
-      </w:pPr>
-      <w:r>
-        <w:rPr>
-          <w:rStyle w:val="VerbatimChar"/>
-        </w:rPr>
-        <w:t xml:space="preserve">Mods.CCNS_HairHeadSearch.CCNS_Search()</w:t>
-      </w:r>
-    </w:p>
-    <w:p>
-      <w:pPr>
         <w:pStyle w:val="Heading2"/>
       </w:pPr>
       <w:bookmarkStart w:id="25" w:name="troubleshooting"/>
@@ -756,9 +789,9 @@
       <w:pPr>
         <w:pStyle w:val="Heading3"/>
       </w:pPr>
-      <w:bookmarkStart w:id="26" w:name="X41e530114ea3cd0a23e2895d4089fa4187f2bf9"/>
-      <w:r>
-        <w:t xml:space="preserve">No labels, no numbers, no panel — nothing changed</w:t>
+      <w:bookmarkStart w:id="26" w:name="no-labels-no-panel-nothing-changed"/>
+      <w:r>
+        <w:t xml:space="preserve">No labels, no panel — nothing changed</w:t>
       </w:r>
       <w:bookmarkEnd w:id="26"/>
     </w:p>
@@ -822,43 +855,31 @@
         <w:pStyle w:val="Compact"/>
       </w:pPr>
       <w:r>
-        <w:t xml:space="preserve">Confirm</w:t>
-      </w:r>
-      <w:r>
-        <w:t xml:space="preserve"> </w:t>
-      </w:r>
-      <w:r>
-        <w:rPr>
-          <w:b/>
-        </w:rPr>
-        <w:t xml:space="preserve">ImprovedUI (mod 16649)</w:t>
-      </w:r>
-      <w:r>
-        <w:t xml:space="preserve"> </w:t>
-      </w:r>
-      <w:r>
-        <w:t xml:space="preserve">is installed and enabled.</w:t>
+        <w:t xml:space="preserve">Check the Script Extender console for a</w:t>
+      </w:r>
+      <w:r>
+        <w:t xml:space="preserve"> </w:t>
+      </w:r>
+      <w:r>
+        <w:rPr>
+          <w:rStyle w:val="VerbatimChar"/>
+        </w:rPr>
+        <w:t xml:space="preserve">[CCNS] v11.11 loaded …</w:t>
+      </w:r>
+      <w:r>
+        <w:t xml:space="preserve"> </w:t>
+      </w:r>
+      <w:r>
+        <w:t xml:space="preserve">line at startup. If it’s absent, the script isn’t loading — re-check load order.</w:t>
       </w:r>
     </w:p>
     <w:p>
       <w:pPr>
         <w:pStyle w:val="Heading3"/>
       </w:pPr>
-      <w:bookmarkStart w:id="27" w:name="X10f958c1b0642af2d3da586f971ab95ef4dc2f3"/>
-      <w:r>
-        <w:t xml:space="preserve">Labels show, but the panel lists everything as</w:t>
-      </w:r>
-      <w:r>
-        <w:t xml:space="preserve"> </w:t>
-      </w:r>
-      <w:r>
-        <w:t xml:space="preserve">“</w:t>
-      </w:r>
-      <w:r>
-        <w:t xml:space="preserve">Vanilla</w:t>
-      </w:r>
-      <w:r>
-        <w:t xml:space="preserve">”</w:t>
+      <w:bookmarkStart w:id="27" w:name="X076cf486cf75729bbd25d69f53ffd42203fe2cd"/>
+      <w:r>
+        <w:t xml:space="preserve">The panel opens, but the thumbnails have no numbers</w:t>
       </w:r>
       <w:bookmarkEnd w:id="27"/>
     </w:p>
@@ -871,70 +892,40 @@
         <w:pStyle w:val="Compact"/>
       </w:pPr>
       <w:r>
-        <w:t xml:space="preserve">The Script Extender script isn’t running, or hasn’t run yet. Make sure CCNS is</w:t>
-      </w:r>
-      <w:r>
-        <w:t xml:space="preserve"> </w:t>
-      </w:r>
-      <w:r>
-        <w:rPr>
-          <w:b/>
-        </w:rPr>
-        <w:t xml:space="preserve">active in load order</w:t>
-      </w:r>
-      <w:r>
-        <w:t xml:space="preserve"> </w:t>
-      </w:r>
-      <w:r>
-        <w:t xml:space="preserve">(step 3) and launch the game at least once after enabling it.</w:t>
-      </w:r>
-    </w:p>
-    <w:p>
-      <w:pPr>
-        <w:numPr>
-          <w:ilvl w:val="0"/>
-          <w:numId w:val="1006"/>
-        </w:numPr>
-        <w:pStyle w:val="Compact"/>
-      </w:pPr>
-      <w:r>
-        <w:t xml:space="preserve">Check the Script Extender console for lines beginning with</w:t>
-      </w:r>
-      <w:r>
-        <w:t xml:space="preserve"> </w:t>
-      </w:r>
+        <w:t xml:space="preserve">Click back and forth between the</w:t>
+      </w:r>
+      <w:r>
+        <w:t xml:space="preserve"> </w:t>
+      </w:r>
+      <w:r>
+        <w:rPr>
+          <w:b/>
+        </w:rPr>
+        <w:t xml:space="preserve">Hair and Head tabs</w:t>
+      </w:r>
+      <w:r>
+        <w:t xml:space="preserve"> </w:t>
+      </w:r>
+      <w:r>
+        <w:t xml:space="preserve">1–2 times. BG3 only repaints the tile labels when a tab is rebuilt, so the round trip is what makes the numbers show. Once they appear they stay for the rest of the session.</w:t>
+      </w:r>
+    </w:p>
+    <w:p>
+      <w:pPr>
+        <w:pStyle w:val="Heading3"/>
+      </w:pPr>
+      <w:bookmarkStart w:id="28" w:name="ctrl-shift-h-does-nothing"/>
       <w:r>
         <w:rPr>
           <w:rStyle w:val="VerbatimChar"/>
         </w:rPr>
-        <w:t xml:space="preserve">[CCNS]</w:t>
-      </w:r>
-      <w:r>
-        <w:t xml:space="preserve">. If they’re absent, the script isn’t loading — re-check load order.</w:t>
-      </w:r>
-    </w:p>
-    <w:p>
-      <w:pPr>
-        <w:pStyle w:val="Heading3"/>
-      </w:pPr>
-      <w:bookmarkStart w:id="28" w:name="the-ctrl-shift-h-hotkey-does-nothing"/>
-      <w:r>
-        <w:t xml:space="preserve">The</w:t>
-      </w:r>
-      <w:r>
-        <w:t xml:space="preserve"> </w:t>
-      </w:r>
-      <w:r>
-        <w:rPr>
-          <w:rStyle w:val="VerbatimChar"/>
-        </w:rPr>
         <w:t xml:space="preserve">Ctrl + Shift + H</w:t>
       </w:r>
       <w:r>
         <w:t xml:space="preserve"> </w:t>
       </w:r>
       <w:r>
-        <w:t xml:space="preserve">hotkey does nothing</w:t>
+        <w:t xml:space="preserve">does nothing</w:t>
       </w:r>
       <w:bookmarkEnd w:id="28"/>
     </w:p>
@@ -947,22 +938,22 @@
         <w:pStyle w:val="Compact"/>
       </w:pPr>
       <w:r>
-        <w:t xml:space="preserve">Use the console fallback:</w:t>
-      </w:r>
-      <w:r>
-        <w:t xml:space="preserve"> </w:t>
-      </w:r>
-      <w:r>
-        <w:rPr>
-          <w:rStyle w:val="VerbatimChar"/>
-        </w:rPr>
-        <w:t xml:space="preserve">Mods.CCNS_HairHeadSearch.CCNS_Search()</w:t>
-      </w:r>
-      <w:r>
-        <w:t xml:space="preserve"> </w:t>
-      </w:r>
-      <w:r>
-        <w:t xml:space="preserve">(in the client context).</w:t>
+        <w:t xml:space="preserve">The panel only opens while you’re on the</w:t>
+      </w:r>
+      <w:r>
+        <w:t xml:space="preserve"> </w:t>
+      </w:r>
+      <w:r>
+        <w:rPr>
+          <w:b/>
+        </w:rPr>
+        <w:t xml:space="preserve">Head or Hair</w:t>
+      </w:r>
+      <w:r>
+        <w:t xml:space="preserve"> </w:t>
+      </w:r>
+      <w:r>
+        <w:t xml:space="preserve">screen — the hotkey is intentionally a no-op elsewhere. Make sure you’re on the hair/head picker.</w:t>
       </w:r>
     </w:p>
     <w:p>
@@ -974,7 +965,7 @@
         <w:pStyle w:val="Compact"/>
       </w:pPr>
       <w:r>
-        <w:t xml:space="preserve">If the console command works but the hotkey doesn’t, another mod may be binding</w:t>
+        <w:t xml:space="preserve">If it still won’t open there, another mod may be binding</w:t>
       </w:r>
       <w:r>
         <w:t xml:space="preserve"> </w:t>
@@ -993,9 +984,21 @@
       <w:pPr>
         <w:pStyle w:val="Heading3"/>
       </w:pPr>
-      <w:bookmarkStart w:id="29" w:name="Xc62609d339efb02176dc471c2193fd59bfe660d"/>
-      <w:r>
-        <w:t xml:space="preserve">Labels don’t appear, or appear wrong, after installing another UI mod</w:t>
+      <w:bookmarkStart w:id="29" w:name="X10f958c1b0642af2d3da586f971ab95ef4dc2f3"/>
+      <w:r>
+        <w:t xml:space="preserve">Labels show, but the panel lists everything as</w:t>
+      </w:r>
+      <w:r>
+        <w:t xml:space="preserve"> </w:t>
+      </w:r>
+      <w:r>
+        <w:t xml:space="preserve">“</w:t>
+      </w:r>
+      <w:r>
+        <w:t xml:space="preserve">Vanilla</w:t>
+      </w:r>
+      <w:r>
+        <w:t xml:space="preserve">”</w:t>
       </w:r>
       <w:bookmarkEnd w:id="29"/>
     </w:p>
@@ -1008,85 +1011,31 @@
         <w:pStyle w:val="Compact"/>
       </w:pPr>
       <w:r>
-        <w:t xml:space="preserve">Another mod may be replacing</w:t>
-      </w:r>
-      <w:r>
-        <w:t xml:space="preserve"> </w:t>
-      </w:r>
-      <w:r>
-        <w:rPr>
-          <w:rStyle w:val="VerbatimChar"/>
-        </w:rPr>
-        <w:t xml:space="preserve">CCLib_k.xaml</w:t>
-      </w:r>
-      <w:r>
-        <w:t xml:space="preserve"> </w:t>
-      </w:r>
-      <w:r>
-        <w:t xml:space="preserve">or</w:t>
-      </w:r>
-      <w:r>
-        <w:t xml:space="preserve"> </w:t>
-      </w:r>
-      <w:r>
-        <w:rPr>
-          <w:rStyle w:val="VerbatimChar"/>
-        </w:rPr>
-        <w:t xml:space="preserve">CCLib_c.xaml</w:t>
-      </w:r>
-      <w:r>
-        <w:t xml:space="preserve">. Only one such override can win, decided by load order. Most notably,</w:t>
-      </w:r>
-      <w:r>
-        <w:t xml:space="preserve"> </w:t>
-      </w:r>
-      <w:r>
-        <w:rPr>
-          <w:b/>
-        </w:rPr>
-        <w:t xml:space="preserve">Customizer’s Compendium (mod 10)</w:t>
-      </w:r>
-      <w:r>
-        <w:t xml:space="preserve"> </w:t>
-      </w:r>
-      <w:r>
-        <w:t xml:space="preserve">conflicts; use the</w:t>
-      </w:r>
-      <w:r>
-        <w:t xml:space="preserve"> </w:t>
-      </w:r>
-      <w:r>
-        <w:rPr>
-          <w:b/>
-        </w:rPr>
-        <w:t xml:space="preserve">Patch 7 Ready</w:t>
-      </w:r>
-      <w:r>
-        <w:t xml:space="preserve"> </w:t>
-      </w:r>
-      <w:r>
-        <w:t xml:space="preserve">version (mod</w:t>
-      </w:r>
-      <w:r>
-        <w:t xml:space="preserve"> </w:t>
-      </w:r>
-      <w:r>
-        <w:rPr>
-          <w:b/>
-        </w:rPr>
-        <w:t xml:space="preserve">12111</w:t>
-      </w:r>
-      <w:r>
-        <w:t xml:space="preserve">) instead. Put CCNS after other UI mods in your load order if you want it to win.</w:t>
+        <w:t xml:space="preserve">The Script Extender script isn’t running, or hasn’t run yet. Make sure CCNS is</w:t>
+      </w:r>
+      <w:r>
+        <w:t xml:space="preserve"> </w:t>
+      </w:r>
+      <w:r>
+        <w:rPr>
+          <w:b/>
+        </w:rPr>
+        <w:t xml:space="preserve">active in load order</w:t>
+      </w:r>
+      <w:r>
+        <w:t xml:space="preserve"> </w:t>
+      </w:r>
+      <w:r>
+        <w:t xml:space="preserve">(step 3) and launch the game at least once after enabling it.</w:t>
       </w:r>
     </w:p>
     <w:p>
       <w:pPr>
         <w:pStyle w:val="Heading3"/>
       </w:pPr>
-      <w:bookmarkStart w:id="30" w:name="controller-labels-dont-show"/>
-      <w:r>
-        <w:t xml:space="preserve">Controller: labels don’t show</w:t>
+      <w:bookmarkStart w:id="30" w:name="Xc62609d339efb02176dc471c2193fd59bfe660d"/>
+      <w:r>
+        <w:t xml:space="preserve">Labels don’t appear, or appear wrong, after installing another UI mod</w:t>
       </w:r>
       <w:bookmarkEnd w:id="30"/>
     </w:p>
@@ -1099,16 +1048,85 @@
         <w:pStyle w:val="Compact"/>
       </w:pPr>
       <w:r>
-        <w:t xml:space="preserve">The game loads the controller UI only while you’re actually using a gamepad. Switch to your controller and reopen the hair/head grid.</w:t>
-      </w:r>
-    </w:p>
-    <w:p>
-      <w:pPr>
-        <w:pStyle w:val="Heading2"/>
-      </w:pPr>
-      <w:bookmarkStart w:id="31" w:name="uninstalling"/>
-      <w:r>
-        <w:t xml:space="preserve">Uninstalling</w:t>
+        <w:t xml:space="preserve">Another mod may be replacing</w:t>
+      </w:r>
+      <w:r>
+        <w:t xml:space="preserve"> </w:t>
+      </w:r>
+      <w:r>
+        <w:rPr>
+          <w:rStyle w:val="VerbatimChar"/>
+        </w:rPr>
+        <w:t xml:space="preserve">CCLib_k.xaml</w:t>
+      </w:r>
+      <w:r>
+        <w:t xml:space="preserve"> </w:t>
+      </w:r>
+      <w:r>
+        <w:t xml:space="preserve">or</w:t>
+      </w:r>
+      <w:r>
+        <w:t xml:space="preserve"> </w:t>
+      </w:r>
+      <w:r>
+        <w:rPr>
+          <w:rStyle w:val="VerbatimChar"/>
+        </w:rPr>
+        <w:t xml:space="preserve">CCLib_c.xaml</w:t>
+      </w:r>
+      <w:r>
+        <w:t xml:space="preserve">. Only one such override can win, decided by load order. Most notably,</w:t>
+      </w:r>
+      <w:r>
+        <w:t xml:space="preserve"> </w:t>
+      </w:r>
+      <w:r>
+        <w:rPr>
+          <w:b/>
+        </w:rPr>
+        <w:t xml:space="preserve">Customizer’s Compendium (mod 10)</w:t>
+      </w:r>
+      <w:r>
+        <w:t xml:space="preserve"> </w:t>
+      </w:r>
+      <w:r>
+        <w:t xml:space="preserve">conflicts; use the</w:t>
+      </w:r>
+      <w:r>
+        <w:t xml:space="preserve"> </w:t>
+      </w:r>
+      <w:r>
+        <w:rPr>
+          <w:b/>
+        </w:rPr>
+        <w:t xml:space="preserve">Patch 7 Ready</w:t>
+      </w:r>
+      <w:r>
+        <w:t xml:space="preserve"> </w:t>
+      </w:r>
+      <w:r>
+        <w:t xml:space="preserve">version (mod</w:t>
+      </w:r>
+      <w:r>
+        <w:t xml:space="preserve"> </w:t>
+      </w:r>
+      <w:r>
+        <w:rPr>
+          <w:b/>
+        </w:rPr>
+        <w:t xml:space="preserve">12111</w:t>
+      </w:r>
+      <w:r>
+        <w:t xml:space="preserve">) instead. Put CCNS after other UI mods in your load order if you want it to win.</w:t>
+      </w:r>
+    </w:p>
+    <w:p>
+      <w:pPr>
+        <w:pStyle w:val="Heading3"/>
+      </w:pPr>
+      <w:bookmarkStart w:id="31" w:name="controller-labels-dont-show"/>
+      <w:r>
+        <w:t xml:space="preserve">Controller: labels don’t show</w:t>
       </w:r>
       <w:bookmarkEnd w:id="31"/>
     </w:p>
@@ -1121,66 +1139,7 @@
         <w:pStyle w:val="Compact"/>
       </w:pPr>
       <w:r>
-        <w:t xml:space="preserve">Delete</w:t>
-      </w:r>
-      <w:r>
-        <w:t xml:space="preserve"> </w:t>
-      </w:r>
-      <w:r>
-        <w:rPr>
-          <w:rStyle w:val="VerbatimChar"/>
-        </w:rPr>
-        <w:t xml:space="preserve">CCNS_HairHeadSearch.pak</w:t>
-      </w:r>
-      <w:r>
-        <w:t xml:space="preserve"> </w:t>
-      </w:r>
-      <w:r>
-        <w:t xml:space="preserve">from your BG3 Mods folder (</w:t>
-      </w:r>
-      <w:r>
-        <w:rPr>
-          <w:rStyle w:val="VerbatimChar"/>
-        </w:rPr>
-        <w:t xml:space="preserve">%LocalAppData%\Larian Studios\Baldur's Gate 3\Mods</w:t>
-      </w:r>
-      <w:r>
-        <w:t xml:space="preserve">), or remove it in your mod manager.</w:t>
-      </w:r>
-    </w:p>
-    <w:p>
-      <w:pPr>
-        <w:numPr>
-          <w:ilvl w:val="0"/>
-          <w:numId w:val="1010"/>
-        </w:numPr>
-        <w:pStyle w:val="Compact"/>
-      </w:pPr>
-      <w:r>
-        <w:t xml:space="preserve">Launch BG3 — the hair/head pickers return to their original look on next launch.</w:t>
-      </w:r>
-    </w:p>
-    <w:p>
-      <w:pPr>
-        <w:pStyle w:val="FirstParagraph"/>
-      </w:pPr>
-      <w:r>
-        <w:t xml:space="preserve">All of CCNS’s changes are runtime-only. Uninstalling makes</w:t>
-      </w:r>
-      <w:r>
-        <w:t xml:space="preserve"> </w:t>
-      </w:r>
-      <w:r>
-        <w:rPr>
-          <w:b/>
-        </w:rPr>
-        <w:t xml:space="preserve">no permanent change</w:t>
-      </w:r>
-      <w:r>
-        <w:t xml:space="preserve"> </w:t>
-      </w:r>
-      <w:r>
-        <w:t xml:space="preserve">to your save or your game files.</w:t>
+        <w:t xml:space="preserve">The game load</w:t>
       </w:r>
     </w:p>
     <w:sectPr/>
@@ -1616,34 +1575,7 @@
     <w:abstractNumId w:val="991"/>
   </w:num>
   <w:num w:numId="1010">
-    <w:abstractNumId w:val="99411"/>
-    <w:lvlOverride w:ilvl="0">
-      <w:startOverride w:val="1"/>
-    </w:lvlOverride>
-    <w:lvlOverride w:ilvl="1">
-      <w:startOverride w:val="1"/>
-    </w:lvlOverride>
-    <w:lvlOverride w:ilvl="2">
-      <w:startOverride w:val="1"/>
-    </w:lvlOverride>
-    <w:lvlOverride w:ilvl="3">
-      <w:startOverride w:val="1"/>
-    </w:lvlOverride>
-    <w:lvlOverride w:ilvl="4">
-      <w:startOverride w:val="1"/>
-    </w:lvlOverride>
-    <w:lvlOverride w:ilvl="5">
-      <w:startOverride w:val="1"/>
-    </w:lvlOverride>
-    <w:lvlOverride w:ilvl="6">
-      <w:startOverride w:val="1"/>
-    </w:lvlOverride>
-    <w:lvlOverride w:ilvl="7">
-      <w:startOverride w:val="1"/>
-    </w:lvlOverride>
-    <w:lvlOverride w:ilvl="8">
-      <w:startOverride w:val="1"/>
-    </w:lvlOverride>
+    <w:abstractNumId w:val="991"/>
   </w:num>
 </w:numbering>
 </file>

</xml_diff>

<commit_message>
v11.14 (release 1.1.0): add Show current Head/Hair button to the search panel
- New panel button filters the results list to the currently-equipped hair/head
  (per active slot) and reports its true thumbnail number (walks the live
  collection, so it is correct even for duplicate vanilla names). Cleared by
  Refresh / typing / source-mod toggle / Show all mods / reopening the panel.
- Fully additive vs v11.13: when unused, every existing path is byte-identical.
  Lua-only change; XAML byte-identical to the v11.9 baseline; meta.lsx unchanged.
- Docs updated to 1.1.0: README/INSTALL (.md/.docx/.pdf) + Nexus BBCode (v1.1)
  + a new Markdown Nexus description; all lead with the update note.
- Adds src_v11_14/ and scripts/build_and_install_v11_14.ps1; retires the stale
  docs/NexusMods_BBCode_v1.0.txt.
</commit_message>
<xml_diff>
--- a/docs/INSTALL.docx
+++ b/docs/INSTALL.docx
@@ -226,7 +226,7 @@
         <w:rPr>
           <w:rStyle w:val="VerbatimChar"/>
         </w:rPr>
-        <w:t xml:space="preserve">CCNS-1.0.0.zip</w:t>
+        <w:t xml:space="preserve">CCNS-1.1.0.zip</w:t>
       </w:r>
       <w:r>
         <w:t xml:space="preserve">. Inside you’ll find</w:t>
@@ -736,13 +736,37 @@
         <w:rPr>
           <w:b/>
         </w:rPr>
-        <w:t xml:space="preserve">Apply a result:</w:t>
-      </w:r>
-      <w:r>
-        <w:t xml:space="preserve"> </w:t>
-      </w:r>
-      <w:r>
-        <w:t xml:space="preserve">click it — the hair/head changes immediately.</w:t>
+        <w:t xml:space="preserve">Show current Head/Hair:</w:t>
+      </w:r>
+      <w:r>
+        <w:t xml:space="preserve"> </w:t>
+      </w:r>
+      <w:r>
+        <w:t xml:space="preserve">click the button to filter the list to the hair or head you currently have equipped and read off its thumbnail number, so you can find the active style in the grid. Clear the filter with</w:t>
+      </w:r>
+      <w:r>
+        <w:t xml:space="preserve"> </w:t>
+      </w:r>
+      <w:r>
+        <w:rPr>
+          <w:b/>
+        </w:rPr>
+        <w:t xml:space="preserve">Refresh</w:t>
+      </w:r>
+      <w:r>
+        <w:t xml:space="preserve">, by typing, by toggling a source-mod filter, with</w:t>
+      </w:r>
+      <w:r>
+        <w:t xml:space="preserve"> </w:t>
+      </w:r>
+      <w:r>
+        <w:rPr>
+          <w:b/>
+        </w:rPr>
+        <w:t xml:space="preserve">Show all mods</w:t>
+      </w:r>
+      <w:r>
+        <w:t xml:space="preserve">, or by reopening the panel.</w:t>
       </w:r>
     </w:p>
     <w:p>
@@ -757,6 +781,27 @@
         <w:rPr>
           <w:b/>
         </w:rPr>
+        <w:t xml:space="preserve">Apply a result:</w:t>
+      </w:r>
+      <w:r>
+        <w:t xml:space="preserve"> </w:t>
+      </w:r>
+      <w:r>
+        <w:t xml:space="preserve">click it — the hair/head changes immediately.</w:t>
+      </w:r>
+    </w:p>
+    <w:p>
+      <w:pPr>
+        <w:numPr>
+          <w:ilvl w:val="0"/>
+          <w:numId w:val="1004"/>
+        </w:numPr>
+        <w:pStyle w:val="Compact"/>
+      </w:pPr>
+      <w:r>
+        <w:rPr>
+          <w:b/>
+        </w:rPr>
         <w:t xml:space="preserve">Walk through matches:</w:t>
       </w:r>
       <w:r>
@@ -864,7 +909,7 @@
         <w:rPr>
           <w:rStyle w:val="VerbatimChar"/>
         </w:rPr>
-        <w:t xml:space="preserve">[CCNS] v11.11 loaded …</w:t>
+        <w:t xml:space="preserve">[CCNS] CCNS v11.14 loaded …</w:t>
       </w:r>
       <w:r>
         <w:t xml:space="preserve"> </w:t>
@@ -1139,7 +1184,88 @@
         <w:pStyle w:val="Compact"/>
       </w:pPr>
       <w:r>
-        <w:t xml:space="preserve">The game load</w:t>
+        <w:t xml:space="preserve">The game loads the controller UI only while you’re actually using a gamepad. Switch to your controller and reopen the hair/head grid. (Note: the search panel itself is keyboard/mouse only, and the brighter selection ring is keyboard-layout only.)</w:t>
+      </w:r>
+    </w:p>
+    <w:p>
+      <w:pPr>
+        <w:pStyle w:val="Heading2"/>
+      </w:pPr>
+      <w:bookmarkStart w:id="32" w:name="uninstalling"/>
+      <w:r>
+        <w:t xml:space="preserve">Uninstalling</w:t>
+      </w:r>
+      <w:bookmarkEnd w:id="32"/>
+    </w:p>
+    <w:p>
+      <w:pPr>
+        <w:numPr>
+          <w:ilvl w:val="0"/>
+          <w:numId w:val="1011"/>
+        </w:numPr>
+        <w:pStyle w:val="Compact"/>
+      </w:pPr>
+      <w:r>
+        <w:t xml:space="preserve">Delete</w:t>
+      </w:r>
+      <w:r>
+        <w:t xml:space="preserve"> </w:t>
+      </w:r>
+      <w:r>
+        <w:rPr>
+          <w:rStyle w:val="VerbatimChar"/>
+        </w:rPr>
+        <w:t xml:space="preserve">CCNS_HairHeadSearch.pak</w:t>
+      </w:r>
+      <w:r>
+        <w:t xml:space="preserve"> </w:t>
+      </w:r>
+      <w:r>
+        <w:t xml:space="preserve">from your BG3 Mods folder (</w:t>
+      </w:r>
+      <w:r>
+        <w:rPr>
+          <w:rStyle w:val="VerbatimChar"/>
+        </w:rPr>
+        <w:t xml:space="preserve">%LocalAppData%\Larian Studios\Baldur's Gate 3\Mods</w:t>
+      </w:r>
+      <w:r>
+        <w:t xml:space="preserve">), or remove it in your mod manager.</w:t>
+      </w:r>
+    </w:p>
+    <w:p>
+      <w:pPr>
+        <w:numPr>
+          <w:ilvl w:val="0"/>
+          <w:numId w:val="1011"/>
+        </w:numPr>
+        <w:pStyle w:val="Compact"/>
+      </w:pPr>
+      <w:r>
+        <w:t xml:space="preserve">Launch BG3 — the hair/head pickers return to their original look on next launch.</w:t>
+      </w:r>
+    </w:p>
+    <w:p>
+      <w:pPr>
+        <w:pStyle w:val="FirstParagraph"/>
+      </w:pPr>
+      <w:r>
+        <w:t xml:space="preserve">All of CCNS’s changes are runtime-only. Uninstalling makes</w:t>
+      </w:r>
+      <w:r>
+        <w:t xml:space="preserve"> </w:t>
+      </w:r>
+      <w:r>
+        <w:rPr>
+          <w:b/>
+        </w:rPr>
+        <w:t xml:space="preserve">no permanent change</w:t>
+      </w:r>
+      <w:r>
+        <w:t xml:space="preserve"> </w:t>
+      </w:r>
+      <w:r>
+        <w:t xml:space="preserve">to your save or your game files.</w:t>
       </w:r>
     </w:p>
     <w:sectPr/>
@@ -1576,6 +1702,36 @@
   </w:num>
   <w:num w:numId="1010">
     <w:abstractNumId w:val="991"/>
+  </w:num>
+  <w:num w:numId="1011">
+    <w:abstractNumId w:val="99411"/>
+    <w:lvlOverride w:ilvl="0">
+      <w:startOverride w:val="1"/>
+    </w:lvlOverride>
+    <w:lvlOverride w:ilvl="1">
+      <w:startOverride w:val="1"/>
+    </w:lvlOverride>
+    <w:lvlOverride w:ilvl="2">
+      <w:startOverride w:val="1"/>
+    </w:lvlOverride>
+    <w:lvlOverride w:ilvl="3">
+      <w:startOverride w:val="1"/>
+    </w:lvlOverride>
+    <w:lvlOverride w:ilvl="4">
+      <w:startOverride w:val="1"/>
+    </w:lvlOverride>
+    <w:lvlOverride w:ilvl="5">
+      <w:startOverride w:val="1"/>
+    </w:lvlOverride>
+    <w:lvlOverride w:ilvl="6">
+      <w:startOverride w:val="1"/>
+    </w:lvlOverride>
+    <w:lvlOverride w:ilvl="7">
+      <w:startOverride w:val="1"/>
+    </w:lvlOverride>
+    <w:lvlOverride w:ilvl="8">
+      <w:startOverride w:val="1"/>
+    </w:lvlOverride>
   </w:num>
 </w:numbering>
 </file>

</xml_diff>